<commit_message>
Programme Noah Vicente : cours prive a payer directement a Thibault
La mention nomme desormais le coach qui donne le prive, pas systematiquement
Yassine.

Co-Authored-By: Claude Opus 5 <noreply@anthropic.com>
Claude-Session: https://claude.ai/code/session_016C6F2i84bo1mZfVdC3FYrw
</commit_message>
<xml_diff>
--- a/Programme_Noah_Vicente.docx
+++ b/Programme_Noah_Vicente.docx
@@ -90,11 +90,19 @@
       </w:r>
     </w:p>
     <w:p>
+      <w:r>
+        <w:t>Samedi : Rassemblement 13h30 – 15h</w:t>
+      </w:r>
+    </w:p>
+    <w:p>
       <w:pPr>
-        <w:spacing w:after="400"/>
+        <w:spacing w:before="120" w:after="280"/>
       </w:pPr>
       <w:r>
-        <w:t>Samedi : Rassemblement 13h30 – 15h</w:t>
+        <w:rPr>
+          <w:i/>
+        </w:rPr>
+        <w:t>Le cours privé (lundi) est à payer directement à Thibault.</w:t>
       </w:r>
     </w:p>
     <w:tbl>

</xml_diff>

<commit_message>
Rassemblements et entrainements exterieurs en remarque, hors tableau
Ajout d'un champ "remarques" dans le generateur ; le rassemblement du
samedi de Noah Vicente sort du tableau de prix.

Co-Authored-By: Claude Opus 5 <noreply@anthropic.com>
Claude-Session: https://claude.ai/code/session_016C6F2i84bo1mZfVdC3FYrw
</commit_message>
<xml_diff>
--- a/Programme_Noah_Vicente.docx
+++ b/Programme_Noah_Vicente.docx
@@ -96,13 +96,24 @@
     </w:p>
     <w:p>
       <w:pPr>
-        <w:spacing w:before="120" w:after="280"/>
+        <w:spacing w:before="120" w:after="80"/>
       </w:pPr>
       <w:r>
         <w:rPr>
           <w:i/>
         </w:rPr>
         <w:t>Le cours privé (lundi) et le semi-privé (mercredi) sont à payer directement à Thibault.</w:t>
+      </w:r>
+    </w:p>
+    <w:p>
+      <w:pPr>
+        <w:spacing w:before="0" w:after="280"/>
+      </w:pPr>
+      <w:r>
+        <w:rPr>
+          <w:i/>
+        </w:rPr>
+        <w:t>Le rassemblement du samedi (13h30 – 15h) se déroule dans un autre club : il n'est pas facturé par l'école.</w:t>
       </w:r>
     </w:p>
     <w:tbl>
@@ -260,47 +271,6 @@
             </w:pPr>
             <w:r>
               <w:t>Collectif 1h</w:t>
-            </w:r>
-          </w:p>
-        </w:tc>
-        <w:tc>
-          <w:tcPr>
-            <w:tcW w:type="dxa" w:w="2268"/>
-          </w:tcPr>
-          <w:p>
-            <w:pPr>
-              <w:spacing w:before="40" w:after="40"/>
-            </w:pPr>
-            <w:r>
-              <w:t>………</w:t>
-            </w:r>
-          </w:p>
-        </w:tc>
-        <w:tc>
-          <w:tcPr>
-            <w:tcW w:type="dxa" w:w="3118"/>
-          </w:tcPr>
-          <w:p>
-            <w:pPr>
-              <w:spacing w:before="40" w:after="40"/>
-            </w:pPr>
-            <w:r>
-              <w:t>………</w:t>
-            </w:r>
-          </w:p>
-        </w:tc>
-      </w:tr>
-      <w:tr>
-        <w:tc>
-          <w:tcPr>
-            <w:tcW w:type="dxa" w:w="3685"/>
-          </w:tcPr>
-          <w:p>
-            <w:pPr>
-              <w:spacing w:before="40" w:after="40"/>
-            </w:pPr>
-            <w:r>
-              <w:t>Rassemblement 1h30</w:t>
             </w:r>
           </w:p>
         </w:tc>

</xml_diff>